<commit_message>
Added goals and objectives
</commit_message>
<xml_diff>
--- a/db_normalization_2/ПРОЕКТИРОВАНИЕ БАЗЫ ДАННЫХ.docx
+++ b/db_normalization_2/ПРОЕКТИРОВАНИЕ БАЗЫ ДАННЫХ.docx
@@ -99,6 +99,236 @@
         </w:rPr>
         <w:t>Для данной работы выбран сценарий: Система бронирования в ресторане. Эта система будет управлять бронированиями клиентов, столиками, персоналом и пунктами меню.</w:t>
       </w:r>
+    </w:p>
+    <w:p>
+      <w:pPr>
+        <w:ind w:firstLine="709"/>
+        <w:jc w:val="both"/>
+        <w:rPr>
+          <w:rFonts w:ascii="Times New Roman" w:hAnsi="Times New Roman" w:cs="Times New Roman"/>
+          <w:b/>
+          <w:bCs/>
+          <w:sz w:val="28"/>
+          <w:szCs w:val="28"/>
+        </w:rPr>
+      </w:pPr>
+      <w:r>
+        <w:rPr>
+          <w:rFonts w:ascii="Times New Roman" w:hAnsi="Times New Roman" w:cs="Times New Roman"/>
+          <w:b/>
+          <w:bCs/>
+          <w:sz w:val="28"/>
+          <w:szCs w:val="28"/>
+        </w:rPr>
+        <w:t>Цели и задачи:</w:t>
+      </w:r>
+    </w:p>
+    <w:p>
+      <w:pPr>
+        <w:numPr>
+          <w:ilvl w:val="0"/>
+          <w:numId w:val="13"/>
+        </w:numPr>
+        <w:tabs>
+          <w:tab w:val="clear" w:pos="720"/>
+          <w:tab w:val="left" w:pos="709"/>
+        </w:tabs>
+        <w:spacing w:after="0"/>
+        <w:ind w:left="0" w:firstLine="426"/>
+        <w:jc w:val="both"/>
+        <w:rPr>
+          <w:rFonts w:ascii="Times New Roman" w:hAnsi="Times New Roman" w:cs="Times New Roman"/>
+          <w:sz w:val="28"/>
+          <w:szCs w:val="28"/>
+        </w:rPr>
+      </w:pPr>
+      <w:r>
+        <w:rPr>
+          <w:rFonts w:ascii="Times New Roman" w:hAnsi="Times New Roman" w:cs="Times New Roman"/>
+          <w:b/>
+          <w:bCs/>
+          <w:sz w:val="28"/>
+          <w:szCs w:val="28"/>
+        </w:rPr>
+        <w:t>Назначение и учёт персонала.</w:t>
+      </w:r>
+      <w:r>
+        <w:rPr>
+          <w:rFonts w:ascii="Times New Roman" w:hAnsi="Times New Roman" w:cs="Times New Roman"/>
+          <w:sz w:val="28"/>
+          <w:szCs w:val="28"/>
+        </w:rPr>
+        <w:t xml:space="preserve"> Каждое бронирование закрепляется за конкретным сотрудником, что упрощает контроль качества и распределение задач.</w:t>
+      </w:r>
+    </w:p>
+    <w:p>
+      <w:pPr>
+        <w:numPr>
+          <w:ilvl w:val="0"/>
+          <w:numId w:val="13"/>
+        </w:numPr>
+        <w:tabs>
+          <w:tab w:val="clear" w:pos="720"/>
+          <w:tab w:val="left" w:pos="709"/>
+        </w:tabs>
+        <w:spacing w:after="0"/>
+        <w:ind w:left="0" w:firstLine="426"/>
+        <w:jc w:val="both"/>
+        <w:rPr>
+          <w:rFonts w:ascii="Times New Roman" w:hAnsi="Times New Roman" w:cs="Times New Roman"/>
+          <w:sz w:val="28"/>
+          <w:szCs w:val="28"/>
+        </w:rPr>
+      </w:pPr>
+      <w:r>
+        <w:rPr>
+          <w:rFonts w:ascii="Times New Roman" w:hAnsi="Times New Roman" w:cs="Times New Roman"/>
+          <w:b/>
+          <w:bCs/>
+          <w:sz w:val="28"/>
+          <w:szCs w:val="28"/>
+        </w:rPr>
+        <w:t>Управление загрузкой зала.</w:t>
+      </w:r>
+      <w:r>
+        <w:rPr>
+          <w:rFonts w:ascii="Times New Roman" w:hAnsi="Times New Roman" w:cs="Times New Roman"/>
+          <w:sz w:val="28"/>
+          <w:szCs w:val="28"/>
+        </w:rPr>
+        <w:t xml:space="preserve"> Ресторан получает актуальную информацию о занятости столов на конкретное время, что позволяет оптимально распределять гостей.</w:t>
+      </w:r>
+    </w:p>
+    <w:p>
+      <w:pPr>
+        <w:numPr>
+          <w:ilvl w:val="0"/>
+          <w:numId w:val="13"/>
+        </w:numPr>
+        <w:tabs>
+          <w:tab w:val="clear" w:pos="720"/>
+          <w:tab w:val="left" w:pos="709"/>
+        </w:tabs>
+        <w:spacing w:after="0"/>
+        <w:ind w:left="0" w:firstLine="426"/>
+        <w:jc w:val="both"/>
+        <w:rPr>
+          <w:rFonts w:ascii="Times New Roman" w:hAnsi="Times New Roman" w:cs="Times New Roman"/>
+          <w:sz w:val="28"/>
+          <w:szCs w:val="28"/>
+        </w:rPr>
+      </w:pPr>
+      <w:r>
+        <w:rPr>
+          <w:rFonts w:ascii="Times New Roman" w:hAnsi="Times New Roman" w:cs="Times New Roman"/>
+          <w:b/>
+          <w:bCs/>
+          <w:sz w:val="28"/>
+          <w:szCs w:val="28"/>
+        </w:rPr>
+        <w:t>Автоматизация процесса бронирования.</w:t>
+      </w:r>
+      <w:r>
+        <w:rPr>
+          <w:rFonts w:ascii="Times New Roman" w:hAnsi="Times New Roman" w:cs="Times New Roman"/>
+          <w:sz w:val="28"/>
+          <w:szCs w:val="28"/>
+        </w:rPr>
+        <w:t xml:space="preserve"> Система позволяет фиксировать бронирования столиков в электронном виде,</w:t>
+      </w:r>
+      <w:r>
+        <w:rPr>
+          <w:rFonts w:ascii="Times New Roman" w:hAnsi="Times New Roman" w:cs="Times New Roman"/>
+          <w:sz w:val="28"/>
+          <w:szCs w:val="28"/>
+        </w:rPr>
+        <w:t xml:space="preserve"> </w:t>
+      </w:r>
+      <w:r>
+        <w:rPr>
+          <w:rFonts w:ascii="Times New Roman" w:hAnsi="Times New Roman" w:cs="Times New Roman"/>
+          <w:sz w:val="28"/>
+          <w:szCs w:val="28"/>
+        </w:rPr>
+        <w:t>минимизируя риск человеческой ошибки</w:t>
+      </w:r>
+      <w:r>
+        <w:rPr>
+          <w:rFonts w:ascii="Times New Roman" w:hAnsi="Times New Roman" w:cs="Times New Roman"/>
+          <w:sz w:val="28"/>
+          <w:szCs w:val="28"/>
+        </w:rPr>
+        <w:t>.</w:t>
+      </w:r>
+    </w:p>
+    <w:p>
+      <w:pPr>
+        <w:numPr>
+          <w:ilvl w:val="0"/>
+          <w:numId w:val="13"/>
+        </w:numPr>
+        <w:tabs>
+          <w:tab w:val="clear" w:pos="720"/>
+          <w:tab w:val="left" w:pos="709"/>
+        </w:tabs>
+        <w:spacing w:after="0"/>
+        <w:ind w:left="0" w:firstLine="426"/>
+        <w:jc w:val="both"/>
+        <w:rPr>
+          <w:rFonts w:ascii="Times New Roman" w:hAnsi="Times New Roman" w:cs="Times New Roman"/>
+          <w:sz w:val="28"/>
+          <w:szCs w:val="28"/>
+        </w:rPr>
+      </w:pPr>
+      <w:r>
+        <w:rPr>
+          <w:rFonts w:ascii="Times New Roman" w:hAnsi="Times New Roman" w:cs="Times New Roman"/>
+          <w:b/>
+          <w:bCs/>
+          <w:sz w:val="28"/>
+          <w:szCs w:val="28"/>
+        </w:rPr>
+        <w:t>Сбор и анализ истории клиентов.</w:t>
+      </w:r>
+      <w:r>
+        <w:rPr>
+          <w:rFonts w:ascii="Times New Roman" w:hAnsi="Times New Roman" w:cs="Times New Roman"/>
+          <w:sz w:val="28"/>
+          <w:szCs w:val="28"/>
+        </w:rPr>
+        <w:t xml:space="preserve"> </w:t>
+      </w:r>
+      <w:r>
+        <w:rPr>
+          <w:rFonts w:ascii="Times New Roman" w:hAnsi="Times New Roman" w:cs="Times New Roman"/>
+          <w:sz w:val="28"/>
+          <w:szCs w:val="28"/>
+        </w:rPr>
+        <w:t>Система накапливает историю посещений, что позволяет отслеживать предпочтения гостей, их любимые блюда и частоту визитов</w:t>
+      </w:r>
+      <w:r>
+        <w:rPr>
+          <w:rFonts w:ascii="Times New Roman" w:hAnsi="Times New Roman" w:cs="Times New Roman"/>
+          <w:sz w:val="28"/>
+          <w:szCs w:val="28"/>
+        </w:rPr>
+        <w:t>.</w:t>
+      </w:r>
+    </w:p>
+    <w:p>
+      <w:pPr>
+        <w:tabs>
+          <w:tab w:val="left" w:pos="709"/>
+        </w:tabs>
+        <w:spacing w:after="0"/>
+        <w:ind w:left="426"/>
+        <w:jc w:val="both"/>
+        <w:rPr>
+          <w:rFonts w:ascii="Times New Roman" w:hAnsi="Times New Roman" w:cs="Times New Roman"/>
+          <w:sz w:val="28"/>
+          <w:szCs w:val="28"/>
+        </w:rPr>
+      </w:pPr>
     </w:p>
     <w:p>
       <w:pPr>
@@ -1066,6 +1296,7 @@
           <w:sz w:val="28"/>
           <w:szCs w:val="28"/>
         </w:rPr>
+        <w:lastRenderedPageBreak/>
         <w:t>UQ_</w:t>
       </w:r>
       <w:r>
@@ -1927,7 +2158,6 @@
           <w:sz w:val="28"/>
           <w:szCs w:val="28"/>
         </w:rPr>
-        <w:lastRenderedPageBreak/>
         <w:t>Table Name:</w:t>
       </w:r>
       <w:r>
@@ -3405,6 +3635,7 @@
           <w:szCs w:val="28"/>
           <w:lang w:val="en-US"/>
         </w:rPr>
+        <w:lastRenderedPageBreak/>
         <w:t>CHK_Reservation</w:t>
       </w:r>
       <w:r>
@@ -4263,7 +4494,6 @@
           <w:sz w:val="28"/>
           <w:szCs w:val="28"/>
         </w:rPr>
-        <w:lastRenderedPageBreak/>
         <w:t>UQ_</w:t>
       </w:r>
       <w:r>
@@ -6046,6 +6276,7 @@
           <w:sz w:val="28"/>
           <w:szCs w:val="28"/>
         </w:rPr>
+        <w:lastRenderedPageBreak/>
         <w:t>Constraint</w:t>
       </w:r>
       <w:r>
@@ -6661,7 +6892,6 @@
           <w:szCs w:val="28"/>
           <w:lang w:val="en-US"/>
         </w:rPr>
-        <w:lastRenderedPageBreak/>
         <w:t>RestaurantTables</w:t>
       </w:r>
       <w:r>
@@ -7704,6 +7934,7 @@
         <w:rPr>
           <w:noProof/>
         </w:rPr>
+        <w:lastRenderedPageBreak/>
         <w:drawing>
           <wp:inline distT="0" distB="0" distL="0" distR="0" wp14:anchorId="5A24034A" wp14:editId="705D6032">
             <wp:extent cx="6831106" cy="2589129"/>
@@ -7813,7 +8044,6 @@
           <w:sz w:val="28"/>
           <w:szCs w:val="28"/>
         </w:rPr>
-        <w:lastRenderedPageBreak/>
         <w:tab/>
       </w:r>
       <w:r>
@@ -7834,26 +8064,37 @@
           <w:bCs/>
           <w:sz w:val="28"/>
           <w:szCs w:val="28"/>
-        </w:rPr>
-        <w:t>-код</w:t>
-      </w:r>
-    </w:p>
-    <w:p>
-      <w:pPr>
-        <w:spacing w:after="0"/>
-        <w:jc w:val="both"/>
-        <w:rPr>
-          <w:rFonts w:ascii="Times New Roman" w:hAnsi="Times New Roman" w:cs="Times New Roman"/>
-          <w:sz w:val="24"/>
-          <w:szCs w:val="24"/>
-          <w:lang w:val="en-US"/>
-        </w:rPr>
-      </w:pPr>
+          <w:lang w:val="en-US"/>
+        </w:rPr>
+        <w:t>-</w:t>
+      </w:r>
       <w:r>
         <w:rPr>
           <w:rFonts w:ascii="Times New Roman" w:hAnsi="Times New Roman" w:cs="Times New Roman"/>
           <w:b/>
           <w:bCs/>
+          <w:sz w:val="28"/>
+          <w:szCs w:val="28"/>
+        </w:rPr>
+        <w:t>код</w:t>
+      </w:r>
+    </w:p>
+    <w:p>
+      <w:pPr>
+        <w:spacing w:after="0"/>
+        <w:jc w:val="both"/>
+        <w:rPr>
+          <w:rFonts w:ascii="Times New Roman" w:hAnsi="Times New Roman" w:cs="Times New Roman"/>
+          <w:sz w:val="24"/>
+          <w:szCs w:val="24"/>
+          <w:lang w:val="en-US"/>
+        </w:rPr>
+      </w:pPr>
+      <w:r>
+        <w:rPr>
+          <w:rFonts w:ascii="Times New Roman" w:hAnsi="Times New Roman" w:cs="Times New Roman"/>
+          <w:b/>
+          <w:bCs/>
           <w:sz w:val="24"/>
           <w:szCs w:val="24"/>
           <w:lang w:val="en-US"/>
@@ -7889,25 +8130,7 @@
           <w:szCs w:val="24"/>
           <w:lang w:val="en-US"/>
         </w:rPr>
-        <w:t xml:space="preserve">    CustomerID</w:t>
-      </w:r>
-      <w:r>
-        <w:rPr>
-          <w:rFonts w:ascii="Times New Roman" w:hAnsi="Times New Roman" w:cs="Times New Roman"/>
-          <w:sz w:val="24"/>
-          <w:szCs w:val="24"/>
-          <w:lang w:val="en-US"/>
-        </w:rPr>
-        <w:t xml:space="preserve"> </w:t>
-      </w:r>
-      <w:r>
-        <w:rPr>
-          <w:rFonts w:ascii="Times New Roman" w:hAnsi="Times New Roman" w:cs="Times New Roman"/>
-          <w:sz w:val="24"/>
-          <w:szCs w:val="24"/>
-          <w:lang w:val="en-US"/>
-        </w:rPr>
-        <w:t>INTEGER,</w:t>
+        <w:t xml:space="preserve">    CustomerID INTEGER,</w:t>
       </w:r>
     </w:p>
     <w:p>
@@ -7929,43 +8152,7 @@
           <w:szCs w:val="24"/>
           <w:lang w:val="en-US"/>
         </w:rPr>
-        <w:t xml:space="preserve">    FirstName</w:t>
-      </w:r>
-      <w:r>
-        <w:rPr>
-          <w:rFonts w:ascii="Times New Roman" w:hAnsi="Times New Roman" w:cs="Times New Roman"/>
-          <w:sz w:val="24"/>
-          <w:szCs w:val="24"/>
-          <w:lang w:val="en-US"/>
-        </w:rPr>
-        <w:t xml:space="preserve"> </w:t>
-      </w:r>
-      <w:r>
-        <w:rPr>
-          <w:rFonts w:ascii="Times New Roman" w:hAnsi="Times New Roman" w:cs="Times New Roman"/>
-          <w:sz w:val="24"/>
-          <w:szCs w:val="24"/>
-          <w:lang w:val="en-US"/>
-        </w:rPr>
-        <w:t>VARCHAR(100)</w:t>
-      </w:r>
-      <w:r>
-        <w:rPr>
-          <w:rFonts w:ascii="Times New Roman" w:hAnsi="Times New Roman" w:cs="Times New Roman"/>
-          <w:sz w:val="24"/>
-          <w:szCs w:val="24"/>
-          <w:lang w:val="en-US"/>
-        </w:rPr>
-        <w:t xml:space="preserve"> </w:t>
-      </w:r>
-      <w:r>
-        <w:rPr>
-          <w:rFonts w:ascii="Times New Roman" w:hAnsi="Times New Roman" w:cs="Times New Roman"/>
-          <w:sz w:val="24"/>
-          <w:szCs w:val="24"/>
-          <w:lang w:val="en-US"/>
-        </w:rPr>
-        <w:t>NOT NULL,</w:t>
+        <w:t xml:space="preserve">    FirstName VARCHAR(100) NOT NULL,</w:t>
       </w:r>
     </w:p>
     <w:p>
@@ -7987,25 +8174,7 @@
           <w:szCs w:val="24"/>
           <w:lang w:val="en-US"/>
         </w:rPr>
-        <w:t xml:space="preserve">    LastName</w:t>
-      </w:r>
-      <w:r>
-        <w:rPr>
-          <w:rFonts w:ascii="Times New Roman" w:hAnsi="Times New Roman" w:cs="Times New Roman"/>
-          <w:sz w:val="24"/>
-          <w:szCs w:val="24"/>
-          <w:lang w:val="en-US"/>
-        </w:rPr>
-        <w:t xml:space="preserve"> </w:t>
-      </w:r>
-      <w:r>
-        <w:rPr>
-          <w:rFonts w:ascii="Times New Roman" w:hAnsi="Times New Roman" w:cs="Times New Roman"/>
-          <w:sz w:val="24"/>
-          <w:szCs w:val="24"/>
-          <w:lang w:val="en-US"/>
-        </w:rPr>
-        <w:t>VARCHAR(100) NOT NULL,</w:t>
+        <w:t xml:space="preserve">    LastName VARCHAR(100) NOT NULL,</w:t>
       </w:r>
     </w:p>
     <w:p>
@@ -8027,43 +8196,7 @@
           <w:szCs w:val="24"/>
           <w:lang w:val="en-US"/>
         </w:rPr>
-        <w:t xml:space="preserve">    Phone</w:t>
-      </w:r>
-      <w:r>
-        <w:rPr>
-          <w:rFonts w:ascii="Times New Roman" w:hAnsi="Times New Roman" w:cs="Times New Roman"/>
-          <w:sz w:val="24"/>
-          <w:szCs w:val="24"/>
-          <w:lang w:val="en-US"/>
-        </w:rPr>
-        <w:t xml:space="preserve"> </w:t>
-      </w:r>
-      <w:r>
-        <w:rPr>
-          <w:rFonts w:ascii="Times New Roman" w:hAnsi="Times New Roman" w:cs="Times New Roman"/>
-          <w:sz w:val="24"/>
-          <w:szCs w:val="24"/>
-          <w:lang w:val="en-US"/>
-        </w:rPr>
-        <w:t>VARCHAR(20)</w:t>
-      </w:r>
-      <w:r>
-        <w:rPr>
-          <w:rFonts w:ascii="Times New Roman" w:hAnsi="Times New Roman" w:cs="Times New Roman"/>
-          <w:sz w:val="24"/>
-          <w:szCs w:val="24"/>
-          <w:lang w:val="en-US"/>
-        </w:rPr>
-        <w:t xml:space="preserve"> </w:t>
-      </w:r>
-      <w:r>
-        <w:rPr>
-          <w:rFonts w:ascii="Times New Roman" w:hAnsi="Times New Roman" w:cs="Times New Roman"/>
-          <w:sz w:val="24"/>
-          <w:szCs w:val="24"/>
-          <w:lang w:val="en-US"/>
-        </w:rPr>
-        <w:t>NOT NULL,</w:t>
+        <w:t xml:space="preserve">    Phone VARCHAR(20) NOT NULL,</w:t>
       </w:r>
     </w:p>
     <w:p>
@@ -8085,25 +8218,7 @@
           <w:szCs w:val="24"/>
           <w:lang w:val="en-US"/>
         </w:rPr>
-        <w:t xml:space="preserve">    Email</w:t>
-      </w:r>
-      <w:r>
-        <w:rPr>
-          <w:rFonts w:ascii="Times New Roman" w:hAnsi="Times New Roman" w:cs="Times New Roman"/>
-          <w:sz w:val="24"/>
-          <w:szCs w:val="24"/>
-          <w:lang w:val="en-US"/>
-        </w:rPr>
-        <w:t xml:space="preserve"> </w:t>
-      </w:r>
-      <w:r>
-        <w:rPr>
-          <w:rFonts w:ascii="Times New Roman" w:hAnsi="Times New Roman" w:cs="Times New Roman"/>
-          <w:sz w:val="24"/>
-          <w:szCs w:val="24"/>
-          <w:lang w:val="en-US"/>
-        </w:rPr>
-        <w:t>VARCHAR(255)</w:t>
+        <w:t xml:space="preserve">    Email VARCHAR(255)</w:t>
       </w:r>
     </w:p>
     <w:p>
@@ -8277,25 +8392,7 @@
           <w:szCs w:val="24"/>
           <w:lang w:val="en-US"/>
         </w:rPr>
-        <w:t xml:space="preserve">    TableID</w:t>
-      </w:r>
-      <w:r>
-        <w:rPr>
-          <w:rFonts w:ascii="Times New Roman" w:hAnsi="Times New Roman" w:cs="Times New Roman"/>
-          <w:sz w:val="24"/>
-          <w:szCs w:val="24"/>
-          <w:lang w:val="en-US"/>
-        </w:rPr>
-        <w:t xml:space="preserve"> </w:t>
-      </w:r>
-      <w:r>
-        <w:rPr>
-          <w:rFonts w:ascii="Times New Roman" w:hAnsi="Times New Roman" w:cs="Times New Roman"/>
-          <w:sz w:val="24"/>
-          <w:szCs w:val="24"/>
-          <w:lang w:val="en-US"/>
-        </w:rPr>
-        <w:t>INTEGER,</w:t>
+        <w:t xml:space="preserve">    TableID INTEGER,</w:t>
       </w:r>
     </w:p>
     <w:p>
@@ -8339,25 +8436,7 @@
           <w:szCs w:val="24"/>
           <w:lang w:val="en-US"/>
         </w:rPr>
-        <w:t xml:space="preserve">    Capacity</w:t>
-      </w:r>
-      <w:r>
-        <w:rPr>
-          <w:rFonts w:ascii="Times New Roman" w:hAnsi="Times New Roman" w:cs="Times New Roman"/>
-          <w:sz w:val="24"/>
-          <w:szCs w:val="24"/>
-          <w:lang w:val="en-US"/>
-        </w:rPr>
-        <w:t xml:space="preserve"> </w:t>
-      </w:r>
-      <w:r>
-        <w:rPr>
-          <w:rFonts w:ascii="Times New Roman" w:hAnsi="Times New Roman" w:cs="Times New Roman"/>
-          <w:sz w:val="24"/>
-          <w:szCs w:val="24"/>
-          <w:lang w:val="en-US"/>
-        </w:rPr>
-        <w:t>INTEGER NOT NULL,</w:t>
+        <w:t xml:space="preserve">    Capacity INTEGER NOT NULL,</w:t>
       </w:r>
     </w:p>
     <w:p>
@@ -8379,25 +8458,7 @@
           <w:szCs w:val="24"/>
           <w:lang w:val="en-US"/>
         </w:rPr>
-        <w:t xml:space="preserve">    Location</w:t>
-      </w:r>
-      <w:r>
-        <w:rPr>
-          <w:rFonts w:ascii="Times New Roman" w:hAnsi="Times New Roman" w:cs="Times New Roman"/>
-          <w:sz w:val="24"/>
-          <w:szCs w:val="24"/>
-          <w:lang w:val="en-US"/>
-        </w:rPr>
-        <w:t xml:space="preserve"> </w:t>
-      </w:r>
-      <w:r>
-        <w:rPr>
-          <w:rFonts w:ascii="Times New Roman" w:hAnsi="Times New Roman" w:cs="Times New Roman"/>
-          <w:sz w:val="24"/>
-          <w:szCs w:val="24"/>
-          <w:lang w:val="en-US"/>
-        </w:rPr>
-        <w:t>VARCHAR(50) NOT NULL</w:t>
+        <w:t xml:space="preserve">    Location VARCHAR(50) NOT NULL</w:t>
       </w:r>
     </w:p>
     <w:p>
@@ -8571,25 +8632,7 @@
           <w:szCs w:val="24"/>
           <w:lang w:val="en-US"/>
         </w:rPr>
-        <w:t xml:space="preserve">    StaffID</w:t>
-      </w:r>
-      <w:r>
-        <w:rPr>
-          <w:rFonts w:ascii="Times New Roman" w:hAnsi="Times New Roman" w:cs="Times New Roman"/>
-          <w:sz w:val="24"/>
-          <w:szCs w:val="24"/>
-          <w:lang w:val="en-US"/>
-        </w:rPr>
-        <w:t xml:space="preserve"> </w:t>
-      </w:r>
-      <w:r>
-        <w:rPr>
-          <w:rFonts w:ascii="Times New Roman" w:hAnsi="Times New Roman" w:cs="Times New Roman"/>
-          <w:sz w:val="24"/>
-          <w:szCs w:val="24"/>
-          <w:lang w:val="en-US"/>
-        </w:rPr>
-        <w:t>INTEGER,</w:t>
+        <w:t xml:space="preserve">    StaffID INTEGER,</w:t>
       </w:r>
     </w:p>
     <w:p>
@@ -8611,25 +8654,7 @@
           <w:szCs w:val="24"/>
           <w:lang w:val="en-US"/>
         </w:rPr>
-        <w:t xml:space="preserve">    FirstName</w:t>
-      </w:r>
-      <w:r>
-        <w:rPr>
-          <w:rFonts w:ascii="Times New Roman" w:hAnsi="Times New Roman" w:cs="Times New Roman"/>
-          <w:sz w:val="24"/>
-          <w:szCs w:val="24"/>
-          <w:lang w:val="en-US"/>
-        </w:rPr>
-        <w:t xml:space="preserve"> </w:t>
-      </w:r>
-      <w:r>
-        <w:rPr>
-          <w:rFonts w:ascii="Times New Roman" w:hAnsi="Times New Roman" w:cs="Times New Roman"/>
-          <w:sz w:val="24"/>
-          <w:szCs w:val="24"/>
-          <w:lang w:val="en-US"/>
-        </w:rPr>
-        <w:t>VARCHAR(100) NOT NULL,</w:t>
+        <w:t xml:space="preserve">    FirstName VARCHAR(100) NOT NULL,</w:t>
       </w:r>
     </w:p>
     <w:p>
@@ -8651,25 +8676,7 @@
           <w:szCs w:val="24"/>
           <w:lang w:val="en-US"/>
         </w:rPr>
-        <w:t xml:space="preserve">    LastName</w:t>
-      </w:r>
-      <w:r>
-        <w:rPr>
-          <w:rFonts w:ascii="Times New Roman" w:hAnsi="Times New Roman" w:cs="Times New Roman"/>
-          <w:sz w:val="24"/>
-          <w:szCs w:val="24"/>
-          <w:lang w:val="en-US"/>
-        </w:rPr>
-        <w:t xml:space="preserve"> </w:t>
-      </w:r>
-      <w:r>
-        <w:rPr>
-          <w:rFonts w:ascii="Times New Roman" w:hAnsi="Times New Roman" w:cs="Times New Roman"/>
-          <w:sz w:val="24"/>
-          <w:szCs w:val="24"/>
-          <w:lang w:val="en-US"/>
-        </w:rPr>
-        <w:t>VARCHAR(100) NOT NULL,</w:t>
+        <w:t xml:space="preserve">    LastName VARCHAR(100) NOT NULL,</w:t>
       </w:r>
     </w:p>
     <w:p>
@@ -8691,25 +8698,7 @@
           <w:szCs w:val="24"/>
           <w:lang w:val="en-US"/>
         </w:rPr>
-        <w:t xml:space="preserve">    Role</w:t>
-      </w:r>
-      <w:r>
-        <w:rPr>
-          <w:rFonts w:ascii="Times New Roman" w:hAnsi="Times New Roman" w:cs="Times New Roman"/>
-          <w:sz w:val="24"/>
-          <w:szCs w:val="24"/>
-          <w:lang w:val="en-US"/>
-        </w:rPr>
-        <w:t xml:space="preserve"> </w:t>
-      </w:r>
-      <w:r>
-        <w:rPr>
-          <w:rFonts w:ascii="Times New Roman" w:hAnsi="Times New Roman" w:cs="Times New Roman"/>
-          <w:sz w:val="24"/>
-          <w:szCs w:val="24"/>
-          <w:lang w:val="en-US"/>
-        </w:rPr>
-        <w:t>VARCHAR(20) NOT NULL,</w:t>
+        <w:t xml:space="preserve">    Role VARCHAR(20) NOT NULL,</w:t>
       </w:r>
     </w:p>
     <w:p>
@@ -8731,25 +8720,7 @@
           <w:szCs w:val="24"/>
           <w:lang w:val="en-US"/>
         </w:rPr>
-        <w:t xml:space="preserve">    Phone</w:t>
-      </w:r>
-      <w:r>
-        <w:rPr>
-          <w:rFonts w:ascii="Times New Roman" w:hAnsi="Times New Roman" w:cs="Times New Roman"/>
-          <w:sz w:val="24"/>
-          <w:szCs w:val="24"/>
-          <w:lang w:val="en-US"/>
-        </w:rPr>
-        <w:t xml:space="preserve"> </w:t>
-      </w:r>
-      <w:r>
-        <w:rPr>
-          <w:rFonts w:ascii="Times New Roman" w:hAnsi="Times New Roman" w:cs="Times New Roman"/>
-          <w:sz w:val="24"/>
-          <w:szCs w:val="24"/>
-          <w:lang w:val="en-US"/>
-        </w:rPr>
-        <w:t>VARCHAR(20) NOT NULL,</w:t>
+        <w:t xml:space="preserve">    Phone VARCHAR(20) NOT NULL,</w:t>
       </w:r>
     </w:p>
     <w:p>
@@ -8771,25 +8742,7 @@
           <w:szCs w:val="24"/>
           <w:lang w:val="en-US"/>
         </w:rPr>
-        <w:t xml:space="preserve">    HireDate</w:t>
-      </w:r>
-      <w:r>
-        <w:rPr>
-          <w:rFonts w:ascii="Times New Roman" w:hAnsi="Times New Roman" w:cs="Times New Roman"/>
-          <w:sz w:val="24"/>
-          <w:szCs w:val="24"/>
-          <w:lang w:val="en-US"/>
-        </w:rPr>
-        <w:t xml:space="preserve"> </w:t>
-      </w:r>
-      <w:r>
-        <w:rPr>
-          <w:rFonts w:ascii="Times New Roman" w:hAnsi="Times New Roman" w:cs="Times New Roman"/>
-          <w:sz w:val="24"/>
-          <w:szCs w:val="24"/>
-          <w:lang w:val="en-US"/>
-        </w:rPr>
-        <w:t>DATE NOT NULL DEFAULT CURRENT_DATE</w:t>
+        <w:t xml:space="preserve">    HireDate DATE NOT NULL DEFAULT CURRENT_DATE</w:t>
       </w:r>
     </w:p>
     <w:p>
@@ -8810,6 +8763,7 @@
           <w:szCs w:val="24"/>
           <w:lang w:val="en-US"/>
         </w:rPr>
+        <w:lastRenderedPageBreak/>
         <w:t>);</w:t>
       </w:r>
     </w:p>
@@ -8941,25 +8895,7 @@
           <w:szCs w:val="24"/>
           <w:lang w:val="en-US"/>
         </w:rPr>
-        <w:t xml:space="preserve">    ItemID</w:t>
-      </w:r>
-      <w:r>
-        <w:rPr>
-          <w:rFonts w:ascii="Times New Roman" w:hAnsi="Times New Roman" w:cs="Times New Roman"/>
-          <w:sz w:val="24"/>
-          <w:szCs w:val="24"/>
-          <w:lang w:val="en-US"/>
-        </w:rPr>
-        <w:t xml:space="preserve"> </w:t>
-      </w:r>
-      <w:r>
-        <w:rPr>
-          <w:rFonts w:ascii="Times New Roman" w:hAnsi="Times New Roman" w:cs="Times New Roman"/>
-          <w:sz w:val="24"/>
-          <w:szCs w:val="24"/>
-          <w:lang w:val="en-US"/>
-        </w:rPr>
-        <w:t>INTEGER,</w:t>
+        <w:t xml:space="preserve">    ItemID INTEGER,</w:t>
       </w:r>
     </w:p>
     <w:p>
@@ -9003,43 +8939,7 @@
           <w:szCs w:val="24"/>
           <w:lang w:val="en-US"/>
         </w:rPr>
-        <w:t xml:space="preserve">    Category</w:t>
-      </w:r>
-      <w:r>
-        <w:rPr>
-          <w:rFonts w:ascii="Times New Roman" w:hAnsi="Times New Roman" w:cs="Times New Roman"/>
-          <w:sz w:val="24"/>
-          <w:szCs w:val="24"/>
-          <w:lang w:val="en-US"/>
-        </w:rPr>
-        <w:t xml:space="preserve"> </w:t>
-      </w:r>
-      <w:r>
-        <w:rPr>
-          <w:rFonts w:ascii="Times New Roman" w:hAnsi="Times New Roman" w:cs="Times New Roman"/>
-          <w:sz w:val="24"/>
-          <w:szCs w:val="24"/>
-          <w:lang w:val="en-US"/>
-        </w:rPr>
-        <w:t>VARCHAR(50)</w:t>
-      </w:r>
-      <w:r>
-        <w:rPr>
-          <w:rFonts w:ascii="Times New Roman" w:hAnsi="Times New Roman" w:cs="Times New Roman"/>
-          <w:sz w:val="24"/>
-          <w:szCs w:val="24"/>
-          <w:lang w:val="en-US"/>
-        </w:rPr>
-        <w:t xml:space="preserve"> </w:t>
-      </w:r>
-      <w:r>
-        <w:rPr>
-          <w:rFonts w:ascii="Times New Roman" w:hAnsi="Times New Roman" w:cs="Times New Roman"/>
-          <w:sz w:val="24"/>
-          <w:szCs w:val="24"/>
-          <w:lang w:val="en-US"/>
-        </w:rPr>
-        <w:t>NOT NULL,</w:t>
+        <w:t xml:space="preserve">    Category VARCHAR(50) NOT NULL,</w:t>
       </w:r>
     </w:p>
     <w:p>
@@ -9226,7 +9126,6 @@
           <w:szCs w:val="24"/>
           <w:lang w:val="en-US"/>
         </w:rPr>
-        <w:lastRenderedPageBreak/>
         <w:t>CREATE TABLE Reservations</w:t>
       </w:r>
       <w:r>
@@ -9368,25 +9267,7 @@
           <w:szCs w:val="24"/>
           <w:lang w:val="en-US"/>
         </w:rPr>
-        <w:t xml:space="preserve">    ReservationDateTime</w:t>
-      </w:r>
-      <w:r>
-        <w:rPr>
-          <w:rFonts w:ascii="Times New Roman" w:hAnsi="Times New Roman" w:cs="Times New Roman"/>
-          <w:sz w:val="24"/>
-          <w:szCs w:val="24"/>
-          <w:lang w:val="en-US"/>
-        </w:rPr>
-        <w:t xml:space="preserve"> </w:t>
-      </w:r>
-      <w:r>
-        <w:rPr>
-          <w:rFonts w:ascii="Times New Roman" w:hAnsi="Times New Roman" w:cs="Times New Roman"/>
-          <w:sz w:val="24"/>
-          <w:szCs w:val="24"/>
-          <w:lang w:val="en-US"/>
-        </w:rPr>
-        <w:t>TIMESTAMP NOT NULL DEFAULT CURRENT_TIMESTAMP,</w:t>
+        <w:t xml:space="preserve">    ReservationDateTime TIMESTAMP NOT NULL DEFAULT CURRENT_TIMESTAMP,</w:t>
       </w:r>
     </w:p>
     <w:p>
@@ -9408,25 +9289,7 @@
           <w:szCs w:val="24"/>
           <w:lang w:val="en-US"/>
         </w:rPr>
-        <w:t xml:space="preserve">    DurationHours</w:t>
-      </w:r>
-      <w:r>
-        <w:rPr>
-          <w:rFonts w:ascii="Times New Roman" w:hAnsi="Times New Roman" w:cs="Times New Roman"/>
-          <w:sz w:val="24"/>
-          <w:szCs w:val="24"/>
-          <w:lang w:val="en-US"/>
-        </w:rPr>
-        <w:t xml:space="preserve"> </w:t>
-      </w:r>
-      <w:r>
-        <w:rPr>
-          <w:rFonts w:ascii="Times New Roman" w:hAnsi="Times New Roman" w:cs="Times New Roman"/>
-          <w:sz w:val="24"/>
-          <w:szCs w:val="24"/>
-          <w:lang w:val="en-US"/>
-        </w:rPr>
-        <w:t>INTEGER NOT NULL DEFAULT 3,</w:t>
+        <w:t xml:space="preserve">    DurationHours INTEGER NOT NULL DEFAULT 3,</w:t>
       </w:r>
     </w:p>
     <w:p>
@@ -9448,25 +9311,7 @@
           <w:szCs w:val="24"/>
           <w:lang w:val="en-US"/>
         </w:rPr>
-        <w:t xml:space="preserve">    ReservationStatus</w:t>
-      </w:r>
-      <w:r>
-        <w:rPr>
-          <w:rFonts w:ascii="Times New Roman" w:hAnsi="Times New Roman" w:cs="Times New Roman"/>
-          <w:sz w:val="24"/>
-          <w:szCs w:val="24"/>
-          <w:lang w:val="en-US"/>
-        </w:rPr>
-        <w:t xml:space="preserve"> </w:t>
-      </w:r>
-      <w:r>
-        <w:rPr>
-          <w:rFonts w:ascii="Times New Roman" w:hAnsi="Times New Roman" w:cs="Times New Roman"/>
-          <w:sz w:val="24"/>
-          <w:szCs w:val="24"/>
-          <w:lang w:val="en-US"/>
-        </w:rPr>
-        <w:t>VARCHAR(20) NOT NULL DEFAULT 'confirmed'</w:t>
+        <w:t xml:space="preserve">    ReservationStatus VARCHAR(20) NOT NULL DEFAULT 'confirmed'</w:t>
       </w:r>
     </w:p>
     <w:p>
@@ -9618,25 +9463,7 @@
           <w:szCs w:val="24"/>
           <w:lang w:val="en-US"/>
         </w:rPr>
-        <w:t xml:space="preserve">    ADD CONSTRAINT</w:t>
-      </w:r>
-      <w:r>
-        <w:rPr>
-          <w:rFonts w:ascii="Times New Roman" w:hAnsi="Times New Roman" w:cs="Times New Roman"/>
-          <w:sz w:val="24"/>
-          <w:szCs w:val="24"/>
-          <w:lang w:val="en-US"/>
-        </w:rPr>
-        <w:t xml:space="preserve"> </w:t>
-      </w:r>
-      <w:r>
-        <w:rPr>
-          <w:rFonts w:ascii="Times New Roman" w:hAnsi="Times New Roman" w:cs="Times New Roman"/>
-          <w:sz w:val="24"/>
-          <w:szCs w:val="24"/>
-          <w:lang w:val="en-US"/>
-        </w:rPr>
-        <w:t>FK_Res_Customer FOREIGN KEY (CustomerID) REFERENCES Customers(CustomerID),</w:t>
+        <w:t xml:space="preserve">    ADD CONSTRAINT FK_Res_Customer FOREIGN KEY (CustomerID) REFERENCES Customers(CustomerID),</w:t>
       </w:r>
     </w:p>
     <w:p>
@@ -9680,25 +9507,7 @@
           <w:szCs w:val="24"/>
           <w:lang w:val="en-US"/>
         </w:rPr>
-        <w:t xml:space="preserve">    ADD CONSTRAINT FK_Res_CreatedBy FOREIGN KEY (CreatedByStaffID)</w:t>
-      </w:r>
-      <w:r>
-        <w:rPr>
-          <w:rFonts w:ascii="Times New Roman" w:hAnsi="Times New Roman" w:cs="Times New Roman"/>
-          <w:sz w:val="24"/>
-          <w:szCs w:val="24"/>
-          <w:lang w:val="en-US"/>
-        </w:rPr>
-        <w:t xml:space="preserve"> </w:t>
-      </w:r>
-      <w:r>
-        <w:rPr>
-          <w:rFonts w:ascii="Times New Roman" w:hAnsi="Times New Roman" w:cs="Times New Roman"/>
-          <w:sz w:val="24"/>
-          <w:szCs w:val="24"/>
-          <w:lang w:val="en-US"/>
-        </w:rPr>
-        <w:t>REFERENCES Staff(StaffID),</w:t>
+        <w:t xml:space="preserve">    ADD CONSTRAINT FK_Res_CreatedBy FOREIGN KEY (CreatedByStaffID) REFERENCES Staff(StaffID),</w:t>
       </w:r>
     </w:p>
     <w:p>
@@ -9710,25 +9519,68 @@
           <w:rFonts w:ascii="Times New Roman" w:hAnsi="Times New Roman" w:cs="Times New Roman"/>
           <w:sz w:val="24"/>
           <w:szCs w:val="24"/>
-        </w:rPr>
-      </w:pPr>
-      <w:r>
-        <w:rPr>
-          <w:rFonts w:ascii="Times New Roman" w:hAnsi="Times New Roman" w:cs="Times New Roman"/>
-          <w:sz w:val="24"/>
-          <w:szCs w:val="24"/>
-          <w:lang w:val="en-US"/>
-        </w:rPr>
-        <w:t xml:space="preserve">    </w:t>
-      </w:r>
-      <w:r>
-        <w:rPr>
-          <w:rFonts w:ascii="Times New Roman" w:hAnsi="Times New Roman" w:cs="Times New Roman"/>
-          <w:sz w:val="24"/>
-          <w:szCs w:val="24"/>
-          <w:lang w:val="en-US"/>
-        </w:rPr>
-        <w:t>ADD CONSTRAINT FK_Res_Waiter FOREIGN KEY (AssignedWaiterID) REFERENCES Staff(StaffID);</w:t>
+          <w:lang w:val="en-US"/>
+        </w:rPr>
+      </w:pPr>
+      <w:r>
+        <w:rPr>
+          <w:rFonts w:ascii="Times New Roman" w:hAnsi="Times New Roman" w:cs="Times New Roman"/>
+          <w:sz w:val="24"/>
+          <w:szCs w:val="24"/>
+          <w:lang w:val="en-US"/>
+        </w:rPr>
+        <w:t xml:space="preserve">    ADD CONSTRAINT FK_Res_Waiter FOREIGN KEY (</w:t>
+      </w:r>
+      <w:proofErr w:type="spellStart"/>
+      <w:r>
+        <w:rPr>
+          <w:rFonts w:ascii="Times New Roman" w:hAnsi="Times New Roman" w:cs="Times New Roman"/>
+          <w:sz w:val="24"/>
+          <w:szCs w:val="24"/>
+          <w:lang w:val="en-US"/>
+        </w:rPr>
+        <w:t>AssignedWaiterID</w:t>
+      </w:r>
+      <w:proofErr w:type="spellEnd"/>
+      <w:r>
+        <w:rPr>
+          <w:rFonts w:ascii="Times New Roman" w:hAnsi="Times New Roman" w:cs="Times New Roman"/>
+          <w:sz w:val="24"/>
+          <w:szCs w:val="24"/>
+          <w:lang w:val="en-US"/>
+        </w:rPr>
+        <w:t xml:space="preserve">) REFERENCES </w:t>
+      </w:r>
+      <w:proofErr w:type="gramStart"/>
+      <w:r>
+        <w:rPr>
+          <w:rFonts w:ascii="Times New Roman" w:hAnsi="Times New Roman" w:cs="Times New Roman"/>
+          <w:sz w:val="24"/>
+          <w:szCs w:val="24"/>
+          <w:lang w:val="en-US"/>
+        </w:rPr>
+        <w:t>Staff(</w:t>
+      </w:r>
+      <w:proofErr w:type="spellStart"/>
+      <w:proofErr w:type="gramEnd"/>
+      <w:r>
+        <w:rPr>
+          <w:rFonts w:ascii="Times New Roman" w:hAnsi="Times New Roman" w:cs="Times New Roman"/>
+          <w:sz w:val="24"/>
+          <w:szCs w:val="24"/>
+          <w:lang w:val="en-US"/>
+        </w:rPr>
+        <w:t>StaffID</w:t>
+      </w:r>
+      <w:proofErr w:type="spellEnd"/>
+      <w:r>
+        <w:rPr>
+          <w:rFonts w:ascii="Times New Roman" w:hAnsi="Times New Roman" w:cs="Times New Roman"/>
+          <w:sz w:val="24"/>
+          <w:szCs w:val="24"/>
+          <w:lang w:val="en-US"/>
+        </w:rPr>
+        <w:t>);</w:t>
       </w:r>
     </w:p>
     <w:p>
@@ -9740,6 +9592,7 @@
           <w:rFonts w:ascii="Times New Roman" w:hAnsi="Times New Roman" w:cs="Times New Roman"/>
           <w:sz w:val="24"/>
           <w:szCs w:val="24"/>
+          <w:lang w:val="en-US"/>
         </w:rPr>
       </w:pPr>
     </w:p>
@@ -9763,8 +9616,21 @@
           <w:szCs w:val="24"/>
           <w:lang w:val="en-US"/>
         </w:rPr>
-        <w:t>CREATE TABLE OrderItems</w:t>
-      </w:r>
+        <w:t xml:space="preserve">CREATE TABLE </w:t>
+      </w:r>
+      <w:proofErr w:type="spellStart"/>
+      <w:r>
+        <w:rPr>
+          <w:rFonts w:ascii="Times New Roman" w:hAnsi="Times New Roman" w:cs="Times New Roman"/>
+          <w:b/>
+          <w:bCs/>
+          <w:sz w:val="24"/>
+          <w:szCs w:val="24"/>
+          <w:lang w:val="en-US"/>
+        </w:rPr>
+        <w:t>OrderItems</w:t>
+      </w:r>
+      <w:proofErr w:type="spellEnd"/>
       <w:r>
         <w:rPr>
           <w:rFonts w:ascii="Times New Roman" w:hAnsi="Times New Roman" w:cs="Times New Roman"/>
@@ -9816,25 +9682,7 @@
           <w:szCs w:val="24"/>
           <w:lang w:val="en-US"/>
         </w:rPr>
-        <w:t xml:space="preserve">    ReservationID</w:t>
-      </w:r>
-      <w:r>
-        <w:rPr>
-          <w:rFonts w:ascii="Times New Roman" w:hAnsi="Times New Roman" w:cs="Times New Roman"/>
-          <w:sz w:val="24"/>
-          <w:szCs w:val="24"/>
-          <w:lang w:val="en-US"/>
-        </w:rPr>
-        <w:t xml:space="preserve"> </w:t>
-      </w:r>
-      <w:r>
-        <w:rPr>
-          <w:rFonts w:ascii="Times New Roman" w:hAnsi="Times New Roman" w:cs="Times New Roman"/>
-          <w:sz w:val="24"/>
-          <w:szCs w:val="24"/>
-          <w:lang w:val="en-US"/>
-        </w:rPr>
-        <w:t>INTEGER NOT NULL,</w:t>
+        <w:t xml:space="preserve">    ReservationID INTEGER NOT NULL,</w:t>
       </w:r>
     </w:p>
     <w:p>
@@ -9856,25 +9704,7 @@
           <w:szCs w:val="24"/>
           <w:lang w:val="en-US"/>
         </w:rPr>
-        <w:t xml:space="preserve">    ItemID</w:t>
-      </w:r>
-      <w:r>
-        <w:rPr>
-          <w:rFonts w:ascii="Times New Roman" w:hAnsi="Times New Roman" w:cs="Times New Roman"/>
-          <w:sz w:val="24"/>
-          <w:szCs w:val="24"/>
-          <w:lang w:val="en-US"/>
-        </w:rPr>
-        <w:t xml:space="preserve"> </w:t>
-      </w:r>
-      <w:r>
-        <w:rPr>
-          <w:rFonts w:ascii="Times New Roman" w:hAnsi="Times New Roman" w:cs="Times New Roman"/>
-          <w:sz w:val="24"/>
-          <w:szCs w:val="24"/>
-          <w:lang w:val="en-US"/>
-        </w:rPr>
-        <w:t>INTEGER NOT NULL,</w:t>
+        <w:t xml:space="preserve">    ItemID INTEGER NOT NULL,</w:t>
       </w:r>
     </w:p>
     <w:p>
@@ -9896,25 +9726,7 @@
           <w:szCs w:val="24"/>
           <w:lang w:val="en-US"/>
         </w:rPr>
-        <w:t xml:space="preserve">    Quantity</w:t>
-      </w:r>
-      <w:r>
-        <w:rPr>
-          <w:rFonts w:ascii="Times New Roman" w:hAnsi="Times New Roman" w:cs="Times New Roman"/>
-          <w:sz w:val="24"/>
-          <w:szCs w:val="24"/>
-          <w:lang w:val="en-US"/>
-        </w:rPr>
-        <w:t xml:space="preserve"> </w:t>
-      </w:r>
-      <w:r>
-        <w:rPr>
-          <w:rFonts w:ascii="Times New Roman" w:hAnsi="Times New Roman" w:cs="Times New Roman"/>
-          <w:sz w:val="24"/>
-          <w:szCs w:val="24"/>
-          <w:lang w:val="en-US"/>
-        </w:rPr>
-        <w:t>INTEGER NOT NULL,</w:t>
+        <w:t xml:space="preserve">    Quantity INTEGER NOT NULL,</w:t>
       </w:r>
     </w:p>
     <w:p>
@@ -9936,25 +9748,8 @@
           <w:szCs w:val="24"/>
           <w:lang w:val="en-US"/>
         </w:rPr>
-        <w:t xml:space="preserve">    UnitPrice</w:t>
-      </w:r>
-      <w:r>
-        <w:rPr>
-          <w:rFonts w:ascii="Times New Roman" w:hAnsi="Times New Roman" w:cs="Times New Roman"/>
-          <w:sz w:val="24"/>
-          <w:szCs w:val="24"/>
-          <w:lang w:val="en-US"/>
-        </w:rPr>
-        <w:t xml:space="preserve"> </w:t>
-      </w:r>
-      <w:r>
-        <w:rPr>
-          <w:rFonts w:ascii="Times New Roman" w:hAnsi="Times New Roman" w:cs="Times New Roman"/>
-          <w:sz w:val="24"/>
-          <w:szCs w:val="24"/>
-          <w:lang w:val="en-US"/>
-        </w:rPr>
-        <w:t>DECIMAL(8,2) NOT NULL,</w:t>
+        <w:lastRenderedPageBreak/>
+        <w:t xml:space="preserve">    UnitPrice DECIMAL(8,2) NOT NULL,</w:t>
       </w:r>
     </w:p>
     <w:p>
@@ -9976,25 +9771,7 @@
           <w:szCs w:val="24"/>
           <w:lang w:val="en-US"/>
         </w:rPr>
-        <w:t xml:space="preserve">    SpecialRequests VARCHAR(100) NOT NULL DEFAULT '</w:t>
-      </w:r>
-      <w:r>
-        <w:rPr>
-          <w:rFonts w:ascii="Times New Roman" w:hAnsi="Times New Roman" w:cs="Times New Roman"/>
-          <w:sz w:val="24"/>
-          <w:szCs w:val="24"/>
-          <w:lang w:val="en-US"/>
-        </w:rPr>
-        <w:t>'</w:t>
-      </w:r>
-      <w:r>
-        <w:rPr>
-          <w:rFonts w:ascii="Times New Roman" w:hAnsi="Times New Roman" w:cs="Times New Roman"/>
-          <w:sz w:val="24"/>
-          <w:szCs w:val="24"/>
-          <w:lang w:val="en-US"/>
-        </w:rPr>
-        <w:t>,</w:t>
+        <w:t xml:space="preserve">    SpecialRequests VARCHAR(100) NOT NULL DEFAULT '',</w:t>
       </w:r>
     </w:p>
     <w:p>
@@ -10050,6 +9827,7 @@
           <w:rFonts w:ascii="Times New Roman" w:hAnsi="Times New Roman" w:cs="Times New Roman"/>
           <w:sz w:val="24"/>
           <w:szCs w:val="24"/>
+          <w:lang w:val="en-US"/>
         </w:rPr>
       </w:pPr>
       <w:r>
@@ -10080,8 +9858,19 @@
           <w:szCs w:val="24"/>
           <w:lang w:val="en-US"/>
         </w:rPr>
-        <w:t>ALTER TABLE OrderItems</w:t>
-      </w:r>
+        <w:t xml:space="preserve">ALTER TABLE </w:t>
+      </w:r>
+      <w:proofErr w:type="spellStart"/>
+      <w:r>
+        <w:rPr>
+          <w:rFonts w:ascii="Times New Roman" w:hAnsi="Times New Roman" w:cs="Times New Roman"/>
+          <w:sz w:val="24"/>
+          <w:szCs w:val="24"/>
+          <w:lang w:val="en-US"/>
+        </w:rPr>
+        <w:t>OrderItems</w:t>
+      </w:r>
+      <w:proofErr w:type="spellEnd"/>
     </w:p>
     <w:p>
       <w:pPr>
@@ -10136,6 +9925,7 @@
           <w:rFonts w:ascii="Times New Roman" w:hAnsi="Times New Roman" w:cs="Times New Roman"/>
           <w:sz w:val="24"/>
           <w:szCs w:val="24"/>
+          <w:lang w:val="en-US"/>
         </w:rPr>
       </w:pPr>
       <w:r>
@@ -10167,7 +9957,27 @@
           <w:szCs w:val="24"/>
           <w:lang w:val="en-US"/>
         </w:rPr>
-        <w:t xml:space="preserve">    ADD CONSTRAINT FK_Ord_Reserv FOREIGN KEY (ReservationID) REFERENCES Reservations(ReservationID),</w:t>
+        <w:t xml:space="preserve">    ADD CONSTRAINT FK_Ord_Reserv FOREIGN KEY (ReservationID) REFERENCES </w:t>
+      </w:r>
+      <w:proofErr w:type="gramStart"/>
+      <w:r>
+        <w:rPr>
+          <w:rFonts w:ascii="Times New Roman" w:hAnsi="Times New Roman" w:cs="Times New Roman"/>
+          <w:sz w:val="24"/>
+          <w:szCs w:val="24"/>
+          <w:lang w:val="en-US"/>
+        </w:rPr>
+        <w:t>Reservations(</w:t>
+      </w:r>
+      <w:proofErr w:type="gramEnd"/>
+      <w:r>
+        <w:rPr>
+          <w:rFonts w:ascii="Times New Roman" w:hAnsi="Times New Roman" w:cs="Times New Roman"/>
+          <w:sz w:val="24"/>
+          <w:szCs w:val="24"/>
+          <w:lang w:val="en-US"/>
+        </w:rPr>
+        <w:t>ReservationID),</w:t>
       </w:r>
     </w:p>
     <w:p>
@@ -10290,6 +10100,155 @@
 <file path=word/numbering.xml><?xml version="1.0" encoding="utf-8"?>
 <w:numbering xmlns:wpc="http://schemas.microsoft.com/office/word/2010/wordprocessingCanvas" xmlns:cx="http://schemas.microsoft.com/office/drawing/2014/chartex" xmlns:cx1="http://schemas.microsoft.com/office/drawing/2015/9/8/chartex" xmlns:cx2="http://schemas.microsoft.com/office/drawing/2015/10/21/chartex" xmlns:cx3="http://schemas.microsoft.com/office/drawing/2016/5/9/chartex" xmlns:cx4="http://schemas.microsoft.com/office/drawing/2016/5/10/chartex" xmlns:cx5="http://schemas.microsoft.com/office/drawing/2016/5/11/chartex" xmlns:cx6="http://schemas.microsoft.com/office/drawing/2016/5/12/chartex" xmlns:cx7="http://schemas.microsoft.com/office/drawing/2016/5/13/chartex" xmlns:cx8="http://schemas.microsoft.com/office/drawing/2016/5/14/chartex" xmlns:mc="http://schemas.openxmlformats.org/markup-compatibility/2006" xmlns:aink="http://schemas.microsoft.com/office/drawing/2016/ink" xmlns:am3d="http://schemas.microsoft.com/office/drawing/2017/model3d" xmlns:o="urn:schemas-microsoft-com:office:office" xmlns:oel="http://schemas.microsoft.com/office/2019/extlst" xmlns:r="http://schemas.openxmlformats.org/officeDocument/2006/relationships" xmlns:m="http://schemas.openxmlformats.org/officeDocument/2006/math" xmlns:v="urn:schemas-microsoft-com:vml" xmlns:wp14="http://schemas.microsoft.com/office/word/2010/wordprocessingDrawing" xmlns:wp="http://schemas.openxmlformats.org/drawingml/2006/wordprocessingDrawing" xmlns:w10="urn:schemas-microsoft-com:office:word" xmlns:w="http://schemas.openxmlformats.org/wordprocessingml/2006/main" xmlns:w14="http://schemas.microsoft.com/office/word/2010/wordml" xmlns:w15="http://schemas.microsoft.com/office/word/2012/wordml" xmlns:w16cei="http://schemas.microsoft.com/office/word/2026/wordml/cei" xmlns:w16cex="http://schemas.microsoft.com/office/word/2018/wordml/cex" xmlns:w16cid="http://schemas.microsoft.com/office/word/2016/wordml/cid" xmlns:w16="http://schemas.microsoft.com/office/word/2018/wordml" xmlns:w16du="http://schemas.microsoft.com/office/word/2023/wordml/word16du" xmlns:w16sdtdh="http://schemas.microsoft.com/office/word/2020/wordml/sdtdatahash" xmlns:w16sdtfl="http://schemas.microsoft.com/office/word/2024/wordml/sdtformatlock" xmlns:w16se="http://schemas.microsoft.com/office/word/2015/wordml/symex" xmlns:wpg="http://schemas.microsoft.com/office/word/2010/wordprocessingGroup" xmlns:wpi="http://schemas.microsoft.com/office/word/2010/wordprocessingInk" xmlns:wne="http://schemas.microsoft.com/office/word/2006/wordml" xmlns:wps="http://schemas.microsoft.com/office/word/2010/wordprocessingShape" mc:Ignorable="w14 w15 w16se w16cid w16 w16cex w16sdtdh w16sdtfl w16du wp14">
   <w:abstractNum w:abstractNumId="0" w15:restartNumberingAfterBreak="0">
+    <w:nsid w:val="00317DA3"/>
+    <w:multiLevelType w:val="multilevel"/>
+    <w:tmpl w:val="7A0A51BC"/>
+    <w:lvl w:ilvl="0">
+      <w:numFmt w:val="bullet"/>
+      <w:lvlText w:val="–"/>
+      <w:lvlJc w:val="left"/>
+      <w:pPr>
+        <w:tabs>
+          <w:tab w:val="num" w:pos="720"/>
+        </w:tabs>
+        <w:ind w:left="720" w:hanging="360"/>
+      </w:pPr>
+      <w:rPr>
+        <w:rFonts w:ascii="Times New Roman" w:eastAsiaTheme="minorHAnsi" w:hAnsi="Times New Roman" w:cs="Times New Roman" w:hint="default"/>
+        <w:sz w:val="28"/>
+        <w:szCs w:val="28"/>
+      </w:rPr>
+    </w:lvl>
+    <w:lvl w:ilvl="1" w:tentative="1">
+      <w:start w:val="1"/>
+      <w:numFmt w:val="bullet"/>
+      <w:lvlText w:val=""/>
+      <w:lvlJc w:val="left"/>
+      <w:pPr>
+        <w:tabs>
+          <w:tab w:val="num" w:pos="1440"/>
+        </w:tabs>
+        <w:ind w:left="1440" w:hanging="360"/>
+      </w:pPr>
+      <w:rPr>
+        <w:rFonts w:ascii="Symbol" w:hAnsi="Symbol" w:hint="default"/>
+        <w:sz w:val="20"/>
+      </w:rPr>
+    </w:lvl>
+    <w:lvl w:ilvl="2" w:tentative="1">
+      <w:start w:val="1"/>
+      <w:numFmt w:val="bullet"/>
+      <w:lvlText w:val=""/>
+      <w:lvlJc w:val="left"/>
+      <w:pPr>
+        <w:tabs>
+          <w:tab w:val="num" w:pos="2160"/>
+        </w:tabs>
+        <w:ind w:left="2160" w:hanging="360"/>
+      </w:pPr>
+      <w:rPr>
+        <w:rFonts w:ascii="Symbol" w:hAnsi="Symbol" w:hint="default"/>
+        <w:sz w:val="20"/>
+      </w:rPr>
+    </w:lvl>
+    <w:lvl w:ilvl="3" w:tentative="1">
+      <w:start w:val="1"/>
+      <w:numFmt w:val="bullet"/>
+      <w:lvlText w:val=""/>
+      <w:lvlJc w:val="left"/>
+      <w:pPr>
+        <w:tabs>
+          <w:tab w:val="num" w:pos="2880"/>
+        </w:tabs>
+        <w:ind w:left="2880" w:hanging="360"/>
+      </w:pPr>
+      <w:rPr>
+        <w:rFonts w:ascii="Symbol" w:hAnsi="Symbol" w:hint="default"/>
+        <w:sz w:val="20"/>
+      </w:rPr>
+    </w:lvl>
+    <w:lvl w:ilvl="4" w:tentative="1">
+      <w:start w:val="1"/>
+      <w:numFmt w:val="bullet"/>
+      <w:lvlText w:val=""/>
+      <w:lvlJc w:val="left"/>
+      <w:pPr>
+        <w:tabs>
+          <w:tab w:val="num" w:pos="3600"/>
+        </w:tabs>
+        <w:ind w:left="3600" w:hanging="360"/>
+      </w:pPr>
+      <w:rPr>
+        <w:rFonts w:ascii="Symbol" w:hAnsi="Symbol" w:hint="default"/>
+        <w:sz w:val="20"/>
+      </w:rPr>
+    </w:lvl>
+    <w:lvl w:ilvl="5" w:tentative="1">
+      <w:start w:val="1"/>
+      <w:numFmt w:val="bullet"/>
+      <w:lvlText w:val=""/>
+      <w:lvlJc w:val="left"/>
+      <w:pPr>
+        <w:tabs>
+          <w:tab w:val="num" w:pos="4320"/>
+        </w:tabs>
+        <w:ind w:left="4320" w:hanging="360"/>
+      </w:pPr>
+      <w:rPr>
+        <w:rFonts w:ascii="Symbol" w:hAnsi="Symbol" w:hint="default"/>
+        <w:sz w:val="20"/>
+      </w:rPr>
+    </w:lvl>
+    <w:lvl w:ilvl="6" w:tentative="1">
+      <w:start w:val="1"/>
+      <w:numFmt w:val="bullet"/>
+      <w:lvlText w:val=""/>
+      <w:lvlJc w:val="left"/>
+      <w:pPr>
+        <w:tabs>
+          <w:tab w:val="num" w:pos="5040"/>
+        </w:tabs>
+        <w:ind w:left="5040" w:hanging="360"/>
+      </w:pPr>
+      <w:rPr>
+        <w:rFonts w:ascii="Symbol" w:hAnsi="Symbol" w:hint="default"/>
+        <w:sz w:val="20"/>
+      </w:rPr>
+    </w:lvl>
+    <w:lvl w:ilvl="7" w:tentative="1">
+      <w:start w:val="1"/>
+      <w:numFmt w:val="bullet"/>
+      <w:lvlText w:val=""/>
+      <w:lvlJc w:val="left"/>
+      <w:pPr>
+        <w:tabs>
+          <w:tab w:val="num" w:pos="5760"/>
+        </w:tabs>
+        <w:ind w:left="5760" w:hanging="360"/>
+      </w:pPr>
+      <w:rPr>
+        <w:rFonts w:ascii="Symbol" w:hAnsi="Symbol" w:hint="default"/>
+        <w:sz w:val="20"/>
+      </w:rPr>
+    </w:lvl>
+    <w:lvl w:ilvl="8" w:tentative="1">
+      <w:start w:val="1"/>
+      <w:numFmt w:val="bullet"/>
+      <w:lvlText w:val=""/>
+      <w:lvlJc w:val="left"/>
+      <w:pPr>
+        <w:tabs>
+          <w:tab w:val="num" w:pos="6480"/>
+        </w:tabs>
+        <w:ind w:left="6480" w:hanging="360"/>
+      </w:pPr>
+      <w:rPr>
+        <w:rFonts w:ascii="Symbol" w:hAnsi="Symbol" w:hint="default"/>
+        <w:sz w:val="20"/>
+      </w:rPr>
+    </w:lvl>
+  </w:abstractNum>
+  <w:abstractNum w:abstractNumId="1" w15:restartNumberingAfterBreak="0">
     <w:nsid w:val="07E92796"/>
     <w:multiLevelType w:val="multilevel"/>
     <w:tmpl w:val="D97023C8"/>
@@ -10438,10 +10397,10 @@
       </w:rPr>
     </w:lvl>
   </w:abstractNum>
-  <w:abstractNum w:abstractNumId="1" w15:restartNumberingAfterBreak="0">
-    <w:nsid w:val="15715614"/>
+  <w:abstractNum w:abstractNumId="2" w15:restartNumberingAfterBreak="0">
+    <w:nsid w:val="0D360088"/>
     <w:multiLevelType w:val="multilevel"/>
-    <w:tmpl w:val="21B0E322"/>
+    <w:tmpl w:val="FFB0B91A"/>
     <w:lvl w:ilvl="0">
       <w:start w:val="1"/>
       <w:numFmt w:val="bullet"/>
@@ -10587,7 +10546,156 @@
       </w:rPr>
     </w:lvl>
   </w:abstractNum>
-  <w:abstractNum w:abstractNumId="2" w15:restartNumberingAfterBreak="0">
+  <w:abstractNum w:abstractNumId="3" w15:restartNumberingAfterBreak="0">
+    <w:nsid w:val="15715614"/>
+    <w:multiLevelType w:val="multilevel"/>
+    <w:tmpl w:val="21B0E322"/>
+    <w:lvl w:ilvl="0">
+      <w:start w:val="1"/>
+      <w:numFmt w:val="bullet"/>
+      <w:lvlText w:val=""/>
+      <w:lvlJc w:val="left"/>
+      <w:pPr>
+        <w:tabs>
+          <w:tab w:val="num" w:pos="720"/>
+        </w:tabs>
+        <w:ind w:left="720" w:hanging="360"/>
+      </w:pPr>
+      <w:rPr>
+        <w:rFonts w:ascii="Symbol" w:hAnsi="Symbol" w:hint="default"/>
+        <w:sz w:val="20"/>
+      </w:rPr>
+    </w:lvl>
+    <w:lvl w:ilvl="1" w:tentative="1">
+      <w:start w:val="1"/>
+      <w:numFmt w:val="bullet"/>
+      <w:lvlText w:val=""/>
+      <w:lvlJc w:val="left"/>
+      <w:pPr>
+        <w:tabs>
+          <w:tab w:val="num" w:pos="1440"/>
+        </w:tabs>
+        <w:ind w:left="1440" w:hanging="360"/>
+      </w:pPr>
+      <w:rPr>
+        <w:rFonts w:ascii="Symbol" w:hAnsi="Symbol" w:hint="default"/>
+        <w:sz w:val="20"/>
+      </w:rPr>
+    </w:lvl>
+    <w:lvl w:ilvl="2" w:tentative="1">
+      <w:start w:val="1"/>
+      <w:numFmt w:val="bullet"/>
+      <w:lvlText w:val=""/>
+      <w:lvlJc w:val="left"/>
+      <w:pPr>
+        <w:tabs>
+          <w:tab w:val="num" w:pos="2160"/>
+        </w:tabs>
+        <w:ind w:left="2160" w:hanging="360"/>
+      </w:pPr>
+      <w:rPr>
+        <w:rFonts w:ascii="Symbol" w:hAnsi="Symbol" w:hint="default"/>
+        <w:sz w:val="20"/>
+      </w:rPr>
+    </w:lvl>
+    <w:lvl w:ilvl="3" w:tentative="1">
+      <w:start w:val="1"/>
+      <w:numFmt w:val="bullet"/>
+      <w:lvlText w:val=""/>
+      <w:lvlJc w:val="left"/>
+      <w:pPr>
+        <w:tabs>
+          <w:tab w:val="num" w:pos="2880"/>
+        </w:tabs>
+        <w:ind w:left="2880" w:hanging="360"/>
+      </w:pPr>
+      <w:rPr>
+        <w:rFonts w:ascii="Symbol" w:hAnsi="Symbol" w:hint="default"/>
+        <w:sz w:val="20"/>
+      </w:rPr>
+    </w:lvl>
+    <w:lvl w:ilvl="4" w:tentative="1">
+      <w:start w:val="1"/>
+      <w:numFmt w:val="bullet"/>
+      <w:lvlText w:val=""/>
+      <w:lvlJc w:val="left"/>
+      <w:pPr>
+        <w:tabs>
+          <w:tab w:val="num" w:pos="3600"/>
+        </w:tabs>
+        <w:ind w:left="3600" w:hanging="360"/>
+      </w:pPr>
+      <w:rPr>
+        <w:rFonts w:ascii="Symbol" w:hAnsi="Symbol" w:hint="default"/>
+        <w:sz w:val="20"/>
+      </w:rPr>
+    </w:lvl>
+    <w:lvl w:ilvl="5" w:tentative="1">
+      <w:start w:val="1"/>
+      <w:numFmt w:val="bullet"/>
+      <w:lvlText w:val=""/>
+      <w:lvlJc w:val="left"/>
+      <w:pPr>
+        <w:tabs>
+          <w:tab w:val="num" w:pos="4320"/>
+        </w:tabs>
+        <w:ind w:left="4320" w:hanging="360"/>
+      </w:pPr>
+      <w:rPr>
+        <w:rFonts w:ascii="Symbol" w:hAnsi="Symbol" w:hint="default"/>
+        <w:sz w:val="20"/>
+      </w:rPr>
+    </w:lvl>
+    <w:lvl w:ilvl="6" w:tentative="1">
+      <w:start w:val="1"/>
+      <w:numFmt w:val="bullet"/>
+      <w:lvlText w:val=""/>
+      <w:lvlJc w:val="left"/>
+      <w:pPr>
+        <w:tabs>
+          <w:tab w:val="num" w:pos="5040"/>
+        </w:tabs>
+        <w:ind w:left="5040" w:hanging="360"/>
+      </w:pPr>
+      <w:rPr>
+        <w:rFonts w:ascii="Symbol" w:hAnsi="Symbol" w:hint="default"/>
+        <w:sz w:val="20"/>
+      </w:rPr>
+    </w:lvl>
+    <w:lvl w:ilvl="7" w:tentative="1">
+      <w:start w:val="1"/>
+      <w:numFmt w:val="bullet"/>
+      <w:lvlText w:val=""/>
+      <w:lvlJc w:val="left"/>
+      <w:pPr>
+        <w:tabs>
+          <w:tab w:val="num" w:pos="5760"/>
+        </w:tabs>
+        <w:ind w:left="5760" w:hanging="360"/>
+      </w:pPr>
+      <w:rPr>
+        <w:rFonts w:ascii="Symbol" w:hAnsi="Symbol" w:hint="default"/>
+        <w:sz w:val="20"/>
+      </w:rPr>
+    </w:lvl>
+    <w:lvl w:ilvl="8" w:tentative="1">
+      <w:start w:val="1"/>
+      <w:numFmt w:val="bullet"/>
+      <w:lvlText w:val=""/>
+      <w:lvlJc w:val="left"/>
+      <w:pPr>
+        <w:tabs>
+          <w:tab w:val="num" w:pos="6480"/>
+        </w:tabs>
+        <w:ind w:left="6480" w:hanging="360"/>
+      </w:pPr>
+      <w:rPr>
+        <w:rFonts w:ascii="Symbol" w:hAnsi="Symbol" w:hint="default"/>
+        <w:sz w:val="20"/>
+      </w:rPr>
+    </w:lvl>
+  </w:abstractNum>
+  <w:abstractNum w:abstractNumId="4" w15:restartNumberingAfterBreak="0">
     <w:nsid w:val="22D44D52"/>
     <w:multiLevelType w:val="hybridMultilevel"/>
     <w:tmpl w:val="F7E81CF2"/>
@@ -10678,7 +10786,7 @@
       </w:pPr>
     </w:lvl>
   </w:abstractNum>
-  <w:abstractNum w:abstractNumId="3" w15:restartNumberingAfterBreak="0">
+  <w:abstractNum w:abstractNumId="5" w15:restartNumberingAfterBreak="0">
     <w:nsid w:val="30F2007B"/>
     <w:multiLevelType w:val="hybridMultilevel"/>
     <w:tmpl w:val="6BE815BA"/>
@@ -10769,7 +10877,7 @@
       </w:pPr>
     </w:lvl>
   </w:abstractNum>
-  <w:abstractNum w:abstractNumId="4" w15:restartNumberingAfterBreak="0">
+  <w:abstractNum w:abstractNumId="6" w15:restartNumberingAfterBreak="0">
     <w:nsid w:val="389E3FF6"/>
     <w:multiLevelType w:val="hybridMultilevel"/>
     <w:tmpl w:val="9860006E"/>
@@ -10881,7 +10989,7 @@
       </w:rPr>
     </w:lvl>
   </w:abstractNum>
-  <w:abstractNum w:abstractNumId="5" w15:restartNumberingAfterBreak="0">
+  <w:abstractNum w:abstractNumId="7" w15:restartNumberingAfterBreak="0">
     <w:nsid w:val="4AB3781B"/>
     <w:multiLevelType w:val="multilevel"/>
     <w:tmpl w:val="EAC2AB4E"/>
@@ -11030,7 +11138,7 @@
       </w:rPr>
     </w:lvl>
   </w:abstractNum>
-  <w:abstractNum w:abstractNumId="6" w15:restartNumberingAfterBreak="0">
+  <w:abstractNum w:abstractNumId="8" w15:restartNumberingAfterBreak="0">
     <w:nsid w:val="4CF46D49"/>
     <w:multiLevelType w:val="hybridMultilevel"/>
     <w:tmpl w:val="C7E65B08"/>
@@ -11142,10 +11250,10 @@
       </w:rPr>
     </w:lvl>
   </w:abstractNum>
-  <w:abstractNum w:abstractNumId="7" w15:restartNumberingAfterBreak="0">
-    <w:nsid w:val="6D9E261E"/>
+  <w:abstractNum w:abstractNumId="9" w15:restartNumberingAfterBreak="0">
+    <w:nsid w:val="511D1129"/>
     <w:multiLevelType w:val="multilevel"/>
-    <w:tmpl w:val="1F320EDE"/>
+    <w:tmpl w:val="1F545680"/>
     <w:lvl w:ilvl="0">
       <w:start w:val="1"/>
       <w:numFmt w:val="bullet"/>
@@ -11291,10 +11399,10 @@
       </w:rPr>
     </w:lvl>
   </w:abstractNum>
-  <w:abstractNum w:abstractNumId="8" w15:restartNumberingAfterBreak="0">
-    <w:nsid w:val="6ECA025B"/>
+  <w:abstractNum w:abstractNumId="10" w15:restartNumberingAfterBreak="0">
+    <w:nsid w:val="6D9E261E"/>
     <w:multiLevelType w:val="multilevel"/>
-    <w:tmpl w:val="3E046A66"/>
+    <w:tmpl w:val="1F320EDE"/>
     <w:lvl w:ilvl="0">
       <w:start w:val="1"/>
       <w:numFmt w:val="bullet"/>
@@ -11440,7 +11548,156 @@
       </w:rPr>
     </w:lvl>
   </w:abstractNum>
-  <w:abstractNum w:abstractNumId="9" w15:restartNumberingAfterBreak="0">
+  <w:abstractNum w:abstractNumId="11" w15:restartNumberingAfterBreak="0">
+    <w:nsid w:val="6ECA025B"/>
+    <w:multiLevelType w:val="multilevel"/>
+    <w:tmpl w:val="3E046A66"/>
+    <w:lvl w:ilvl="0">
+      <w:start w:val="1"/>
+      <w:numFmt w:val="bullet"/>
+      <w:lvlText w:val=""/>
+      <w:lvlJc w:val="left"/>
+      <w:pPr>
+        <w:tabs>
+          <w:tab w:val="num" w:pos="720"/>
+        </w:tabs>
+        <w:ind w:left="720" w:hanging="360"/>
+      </w:pPr>
+      <w:rPr>
+        <w:rFonts w:ascii="Symbol" w:hAnsi="Symbol" w:hint="default"/>
+        <w:sz w:val="20"/>
+      </w:rPr>
+    </w:lvl>
+    <w:lvl w:ilvl="1" w:tentative="1">
+      <w:start w:val="1"/>
+      <w:numFmt w:val="bullet"/>
+      <w:lvlText w:val=""/>
+      <w:lvlJc w:val="left"/>
+      <w:pPr>
+        <w:tabs>
+          <w:tab w:val="num" w:pos="1440"/>
+        </w:tabs>
+        <w:ind w:left="1440" w:hanging="360"/>
+      </w:pPr>
+      <w:rPr>
+        <w:rFonts w:ascii="Symbol" w:hAnsi="Symbol" w:hint="default"/>
+        <w:sz w:val="20"/>
+      </w:rPr>
+    </w:lvl>
+    <w:lvl w:ilvl="2" w:tentative="1">
+      <w:start w:val="1"/>
+      <w:numFmt w:val="bullet"/>
+      <w:lvlText w:val=""/>
+      <w:lvlJc w:val="left"/>
+      <w:pPr>
+        <w:tabs>
+          <w:tab w:val="num" w:pos="2160"/>
+        </w:tabs>
+        <w:ind w:left="2160" w:hanging="360"/>
+      </w:pPr>
+      <w:rPr>
+        <w:rFonts w:ascii="Symbol" w:hAnsi="Symbol" w:hint="default"/>
+        <w:sz w:val="20"/>
+      </w:rPr>
+    </w:lvl>
+    <w:lvl w:ilvl="3" w:tentative="1">
+      <w:start w:val="1"/>
+      <w:numFmt w:val="bullet"/>
+      <w:lvlText w:val=""/>
+      <w:lvlJc w:val="left"/>
+      <w:pPr>
+        <w:tabs>
+          <w:tab w:val="num" w:pos="2880"/>
+        </w:tabs>
+        <w:ind w:left="2880" w:hanging="360"/>
+      </w:pPr>
+      <w:rPr>
+        <w:rFonts w:ascii="Symbol" w:hAnsi="Symbol" w:hint="default"/>
+        <w:sz w:val="20"/>
+      </w:rPr>
+    </w:lvl>
+    <w:lvl w:ilvl="4" w:tentative="1">
+      <w:start w:val="1"/>
+      <w:numFmt w:val="bullet"/>
+      <w:lvlText w:val=""/>
+      <w:lvlJc w:val="left"/>
+      <w:pPr>
+        <w:tabs>
+          <w:tab w:val="num" w:pos="3600"/>
+        </w:tabs>
+        <w:ind w:left="3600" w:hanging="360"/>
+      </w:pPr>
+      <w:rPr>
+        <w:rFonts w:ascii="Symbol" w:hAnsi="Symbol" w:hint="default"/>
+        <w:sz w:val="20"/>
+      </w:rPr>
+    </w:lvl>
+    <w:lvl w:ilvl="5" w:tentative="1">
+      <w:start w:val="1"/>
+      <w:numFmt w:val="bullet"/>
+      <w:lvlText w:val=""/>
+      <w:lvlJc w:val="left"/>
+      <w:pPr>
+        <w:tabs>
+          <w:tab w:val="num" w:pos="4320"/>
+        </w:tabs>
+        <w:ind w:left="4320" w:hanging="360"/>
+      </w:pPr>
+      <w:rPr>
+        <w:rFonts w:ascii="Symbol" w:hAnsi="Symbol" w:hint="default"/>
+        <w:sz w:val="20"/>
+      </w:rPr>
+    </w:lvl>
+    <w:lvl w:ilvl="6" w:tentative="1">
+      <w:start w:val="1"/>
+      <w:numFmt w:val="bullet"/>
+      <w:lvlText w:val=""/>
+      <w:lvlJc w:val="left"/>
+      <w:pPr>
+        <w:tabs>
+          <w:tab w:val="num" w:pos="5040"/>
+        </w:tabs>
+        <w:ind w:left="5040" w:hanging="360"/>
+      </w:pPr>
+      <w:rPr>
+        <w:rFonts w:ascii="Symbol" w:hAnsi="Symbol" w:hint="default"/>
+        <w:sz w:val="20"/>
+      </w:rPr>
+    </w:lvl>
+    <w:lvl w:ilvl="7" w:tentative="1">
+      <w:start w:val="1"/>
+      <w:numFmt w:val="bullet"/>
+      <w:lvlText w:val=""/>
+      <w:lvlJc w:val="left"/>
+      <w:pPr>
+        <w:tabs>
+          <w:tab w:val="num" w:pos="5760"/>
+        </w:tabs>
+        <w:ind w:left="5760" w:hanging="360"/>
+      </w:pPr>
+      <w:rPr>
+        <w:rFonts w:ascii="Symbol" w:hAnsi="Symbol" w:hint="default"/>
+        <w:sz w:val="20"/>
+      </w:rPr>
+    </w:lvl>
+    <w:lvl w:ilvl="8" w:tentative="1">
+      <w:start w:val="1"/>
+      <w:numFmt w:val="bullet"/>
+      <w:lvlText w:val=""/>
+      <w:lvlJc w:val="left"/>
+      <w:pPr>
+        <w:tabs>
+          <w:tab w:val="num" w:pos="6480"/>
+        </w:tabs>
+        <w:ind w:left="6480" w:hanging="360"/>
+      </w:pPr>
+      <w:rPr>
+        <w:rFonts w:ascii="Symbol" w:hAnsi="Symbol" w:hint="default"/>
+        <w:sz w:val="20"/>
+      </w:rPr>
+    </w:lvl>
+  </w:abstractNum>
+  <w:abstractNum w:abstractNumId="12" w15:restartNumberingAfterBreak="0">
     <w:nsid w:val="6F1677FB"/>
     <w:multiLevelType w:val="hybridMultilevel"/>
     <w:tmpl w:val="2C6A5E34"/>
@@ -11529,7 +11786,7 @@
       </w:pPr>
     </w:lvl>
   </w:abstractNum>
-  <w:abstractNum w:abstractNumId="10" w15:restartNumberingAfterBreak="0">
+  <w:abstractNum w:abstractNumId="13" w15:restartNumberingAfterBreak="0">
     <w:nsid w:val="7C911B89"/>
     <w:multiLevelType w:val="hybridMultilevel"/>
     <w:tmpl w:val="277C0612"/>
@@ -11642,37 +11899,46 @@
     </w:lvl>
   </w:abstractNum>
   <w:num w:numId="1" w16cid:durableId="1661956759">
+    <w:abstractNumId w:val="12"/>
+  </w:num>
+  <w:num w:numId="2" w16cid:durableId="567811101">
+    <w:abstractNumId w:val="5"/>
+  </w:num>
+  <w:num w:numId="3" w16cid:durableId="210925734">
+    <w:abstractNumId w:val="6"/>
+  </w:num>
+  <w:num w:numId="4" w16cid:durableId="1984311759">
+    <w:abstractNumId w:val="13"/>
+  </w:num>
+  <w:num w:numId="5" w16cid:durableId="427966316">
+    <w:abstractNumId w:val="8"/>
+  </w:num>
+  <w:num w:numId="6" w16cid:durableId="2041468526">
+    <w:abstractNumId w:val="4"/>
+  </w:num>
+  <w:num w:numId="7" w16cid:durableId="1522744497">
+    <w:abstractNumId w:val="10"/>
+  </w:num>
+  <w:num w:numId="8" w16cid:durableId="430972375">
+    <w:abstractNumId w:val="3"/>
+  </w:num>
+  <w:num w:numId="9" w16cid:durableId="448941398">
+    <w:abstractNumId w:val="11"/>
+  </w:num>
+  <w:num w:numId="10" w16cid:durableId="363755708">
+    <w:abstractNumId w:val="1"/>
+  </w:num>
+  <w:num w:numId="11" w16cid:durableId="831067289">
+    <w:abstractNumId w:val="7"/>
+  </w:num>
+  <w:num w:numId="12" w16cid:durableId="2085948923">
     <w:abstractNumId w:val="9"/>
   </w:num>
-  <w:num w:numId="2" w16cid:durableId="567811101">
-    <w:abstractNumId w:val="3"/>
-  </w:num>
-  <w:num w:numId="3" w16cid:durableId="210925734">
-    <w:abstractNumId w:val="4"/>
-  </w:num>
-  <w:num w:numId="4" w16cid:durableId="1984311759">
-    <w:abstractNumId w:val="10"/>
-  </w:num>
-  <w:num w:numId="5" w16cid:durableId="427966316">
-    <w:abstractNumId w:val="6"/>
-  </w:num>
-  <w:num w:numId="6" w16cid:durableId="2041468526">
-    <w:abstractNumId w:val="2"/>
-  </w:num>
-  <w:num w:numId="7" w16cid:durableId="1522744497">
-    <w:abstractNumId w:val="7"/>
-  </w:num>
-  <w:num w:numId="8" w16cid:durableId="430972375">
-    <w:abstractNumId w:val="1"/>
-  </w:num>
-  <w:num w:numId="9" w16cid:durableId="448941398">
-    <w:abstractNumId w:val="8"/>
-  </w:num>
-  <w:num w:numId="10" w16cid:durableId="363755708">
+  <w:num w:numId="13" w16cid:durableId="400063485">
     <w:abstractNumId w:val="0"/>
   </w:num>
-  <w:num w:numId="11" w16cid:durableId="831067289">
-    <w:abstractNumId w:val="5"/>
+  <w:num w:numId="14" w16cid:durableId="1749695885">
+    <w:abstractNumId w:val="2"/>
   </w:num>
 </w:numbering>
 </file>
@@ -12639,6 +12905,17 @@
       <w:szCs w:val="20"/>
     </w:rPr>
   </w:style>
+  <w:style w:type="character" w:styleId="ac">
+    <w:name w:val="Strong"/>
+    <w:basedOn w:val="a0"/>
+    <w:uiPriority w:val="22"/>
+    <w:qFormat/>
+    <w:rsid w:val="006853DA"/>
+    <w:rPr>
+      <w:b/>
+      <w:bCs/>
+    </w:rPr>
+  </w:style>
 </w:styles>
 </file>
 

</xml_diff>